<commit_message>
docs: update help documentation, add reader guides, and include new system UI screenshots
</commit_message>
<xml_diff>
--- a/nextjs_space/docs/huong-dan/quan-tri-he-thong.docx
+++ b/nextjs_space/docs/huong-dan/quan-tri-he-thong.docx
@@ -10,7 +10,7 @@
         <w:t xml:space="preserve">Hướng dẫn sử dụng</w:t>
       </w:r>
     </w:p>
-    <w:bookmarkStart w:id="30" w:name="Xd7e62951e9502e520ae5ff0e0bd654359c63a6a"/>
+    <w:bookmarkStart w:id="33" w:name="Xd7e62951e9502e520ae5ff0e0bd654359c63a6a"/>
     <w:p>
       <w:pPr>
         <w:pStyle w:val="Heading1"/>
@@ -333,7 +333,7 @@
       </w:r>
     </w:p>
     <w:bookmarkEnd w:id="22"/>
-    <w:bookmarkStart w:id="23" w:name="đăng-nhập-bảng-điều-khiển"/>
+    <w:bookmarkStart w:id="26" w:name="đăng-nhập-bảng-điều-khiển"/>
     <w:p>
       <w:pPr>
         <w:pStyle w:val="Heading2"/>
@@ -419,10 +419,65 @@
     </w:p>
     <w:p>
       <w:pPr>
+        <w:pStyle w:val="CaptionedFigure"/>
+      </w:pPr>
+      <w:r>
+        <w:drawing>
+          <wp:inline>
+            <wp:extent cx="5334000" cy="5345112"/>
+            <wp:effectExtent b="0" l="0" r="0" t="0"/>
+            <wp:docPr descr="Bảng điều khiển Quản trị" title="" id="24" name="Picture"/>
+            <a:graphic>
+              <a:graphicData uri="http://schemas.openxmlformats.org/drawingml/2006/picture">
+                <pic:pic>
+                  <pic:nvPicPr>
+                    <pic:cNvPr descr="../../public/help/screenshots/admin-dashboard.png" id="25" name="Picture"/>
+                    <pic:cNvPicPr>
+                      <a:picLocks noChangeArrowheads="1" noChangeAspect="1"/>
+                    </pic:cNvPicPr>
+                  </pic:nvPicPr>
+                  <pic:blipFill>
+                    <a:blip r:embed="rId23"/>
+                    <a:stretch>
+                      <a:fillRect/>
+                    </a:stretch>
+                  </pic:blipFill>
+                  <pic:spPr bwMode="auto">
+                    <a:xfrm>
+                      <a:off x="0" y="0"/>
+                      <a:ext cx="5334000" cy="5345112"/>
+                    </a:xfrm>
+                    <a:prstGeom prst="rect">
+                      <a:avLst/>
+                    </a:prstGeom>
+                    <a:noFill/>
+                    <a:ln w="9525">
+                      <a:noFill/>
+                      <a:headEnd/>
+                      <a:tailEnd/>
+                    </a:ln>
+                  </pic:spPr>
+                </pic:pic>
+              </a:graphicData>
+            </a:graphic>
+          </wp:inline>
+        </w:drawing>
+      </w:r>
+    </w:p>
+    <w:p>
+      <w:pPr>
+        <w:pStyle w:val="ImageCaption"/>
+      </w:pPr>
+      <w:r>
+        <w:t xml:space="preserve">Bảng điều khiển Quản trị</w:t>
+      </w:r>
+    </w:p>
+    <w:p>
+      <w:pPr>
         <w:pStyle w:val="BodyText"/>
       </w:pPr>
       <w:r>
-        <w:t xml:space="preserve">Dashboard tổng hợp tình trạng hệ thống: người dùng, bài/đợt xuất bản, hoạt động, cảnh báo.</w:t>
+        <w:t xml:space="preserve">Dashboard tổng hợp tình trạng hệ thống: người dùng theo vai trò, bài báo &amp; trạng thái, hoạt động gần đây (nhật ký), người dùng mới.</w:t>
       </w:r>
     </w:p>
     <w:p>
@@ -432,8 +487,8 @@
         </w:pict>
       </w:r>
     </w:p>
-    <w:bookmarkEnd w:id="23"/>
-    <w:bookmarkStart w:id="24" w:name="quản-lý-người-dùng-phân-quyền-rbac"/>
+    <w:bookmarkEnd w:id="26"/>
+    <w:bookmarkStart w:id="27" w:name="quản-lý-người-dùng-phân-quyền-rbac"/>
     <w:p>
       <w:pPr>
         <w:pStyle w:val="Heading2"/>
@@ -825,8 +880,8 @@
         </w:pict>
       </w:r>
     </w:p>
-    <w:bookmarkEnd w:id="24"/>
-    <w:bookmarkStart w:id="25" w:name="quản-lý-nội-dung-cms"/>
+    <w:bookmarkEnd w:id="27"/>
+    <w:bookmarkStart w:id="28" w:name="quản-lý-nội-dung-cms"/>
     <w:p>
       <w:pPr>
         <w:pStyle w:val="Heading2"/>
@@ -1019,8 +1074,8 @@
         </w:pict>
       </w:r>
     </w:p>
-    <w:bookmarkEnd w:id="25"/>
-    <w:bookmarkStart w:id="26" w:name="hệ-thống-phân-tích"/>
+    <w:bookmarkEnd w:id="28"/>
+    <w:bookmarkStart w:id="29" w:name="hệ-thống-phân-tích"/>
     <w:p>
       <w:pPr>
         <w:pStyle w:val="Heading2"/>
@@ -1353,8 +1408,8 @@
         </w:pict>
       </w:r>
     </w:p>
-    <w:bookmarkEnd w:id="26"/>
-    <w:bookmarkStart w:id="27" w:name="bảo-mật-audit"/>
+    <w:bookmarkEnd w:id="29"/>
+    <w:bookmarkStart w:id="30" w:name="bảo-mật-audit"/>
     <w:p>
       <w:pPr>
         <w:pStyle w:val="Heading2"/>
@@ -1422,8 +1477,8 @@
         </w:pict>
       </w:r>
     </w:p>
-    <w:bookmarkEnd w:id="27"/>
-    <w:bookmarkStart w:id="28" w:name="web-crawler"/>
+    <w:bookmarkEnd w:id="30"/>
+    <w:bookmarkStart w:id="31" w:name="web-crawler"/>
     <w:p>
       <w:pPr>
         <w:pStyle w:val="Heading2"/>
@@ -1482,8 +1537,8 @@
         </w:pict>
       </w:r>
     </w:p>
-    <w:bookmarkEnd w:id="28"/>
-    <w:bookmarkStart w:id="29" w:name="lưu-ý-vận-hành"/>
+    <w:bookmarkEnd w:id="31"/>
+    <w:bookmarkStart w:id="32" w:name="lưu-ý-vận-hành"/>
     <w:p>
       <w:pPr>
         <w:pStyle w:val="Heading2"/>
@@ -1651,8 +1706,8 @@
         <w:t xml:space="preserve">.</w:t>
       </w:r>
     </w:p>
-    <w:bookmarkEnd w:id="29"/>
-    <w:bookmarkEnd w:id="30"/>
+    <w:bookmarkEnd w:id="32"/>
+    <w:bookmarkEnd w:id="33"/>
     <w:sectPr/>
   </w:body>
 </w:document>

</xml_diff>